<commit_message>
Update portfolio with new resume and operations features
</commit_message>
<xml_diff>
--- a/assets/Henry_Fadeni_Applied_AI_Software_Engineer.docx
+++ b/assets/Henry_Fadeni_Applied_AI_Software_Engineer.docx
@@ -766,7 +766,7 @@
                 <w:color w:val="0F172A"/>
                 <w:sz w:val="17"/>
               </w:rPr>
-              <w:t>Freelance Applied AI &amp; Software Engineer</w:t>
+              <w:t>Automation Engineer</w:t>
             </w:r>
             <w:r>
               <w:rPr>
@@ -774,7 +774,7 @@
                 <w:color w:val="475569"/>
                 <w:sz w:val="16"/>
               </w:rPr>
-              <w:t xml:space="preserve"> | Independent Engineering &amp; Consulting</w:t>
+              <w:t xml:space="preserve"> | Cedarstone Business Services (Contract)</w:t>
             </w:r>
           </w:p>
         </w:tc>
@@ -799,7 +799,7 @@
                 <w:color w:val="0F172A"/>
                 <w:sz w:val="16"/>
               </w:rPr>
-              <w:t>Jan 2025 – Present</w:t>
+              <w:t>Feb 2026 – Jul 2026</w:t>
             </w:r>
             <w:r>
               <w:rPr>
@@ -822,7 +822,7 @@
           <w:color w:val="334155"/>
           <w:sz w:val="16"/>
         </w:rPr>
-        <w:t>Delivered LLM systems, RAG workflows, agentic automation pipelines, and backend APIs across three engagements: a Series A logistics SaaS (Germany), an e-commerce operator (Nigeria), and a recruitment agency (Netherlands). Named references available on request.</w:t>
+        <w:t>Engineered business automation workflows covering proposal preparation, invoice receivables follow-up, and client onboarding.</w:t>
       </w:r>
     </w:p>
     <w:p>
@@ -836,7 +836,7 @@
           <w:color w:val="334155"/>
           <w:sz w:val="16"/>
         </w:rPr>
-        <w:t>Automated lead qualification end-to-end with n8n and a classification agent, tripling qualified-lead volume (~45 → ~140/week) with no added headcount.</w:t>
+        <w:t>Implemented automated pricing calculations, multi-tier discount approval routing, dispute-aware payment tracking, and onboarding exception handling.</w:t>
       </w:r>
     </w:p>
     <w:tbl>
@@ -871,7 +871,7 @@
                 <w:color w:val="0F172A"/>
                 <w:sz w:val="17"/>
               </w:rPr>
-              <w:t>Electrical &amp; Automation Engineering Intern</w:t>
+              <w:t>Backend Engineer</w:t>
             </w:r>
             <w:r>
               <w:rPr>
@@ -879,7 +879,7 @@
                 <w:color w:val="475569"/>
                 <w:sz w:val="16"/>
               </w:rPr>
-              <w:t xml:space="preserve"> | Promasidor Nigeria Limited</w:t>
+              <w:t xml:space="preserve"> | Cedar Freight Technologies (Freelance)</w:t>
             </w:r>
           </w:p>
         </w:tc>
@@ -904,13 +904,13 @@
                 <w:color w:val="0F172A"/>
                 <w:sz w:val="16"/>
               </w:rPr>
-              <w:t>May 2024 – Sep 2024</w:t>
+              <w:t>Jan 2025 – Present</w:t>
             </w:r>
             <w:r>
               <w:rPr>
                 <w:sz w:val="15"/>
               </w:rPr>
-              <w:t xml:space="preserve">  (Lagos, NG)</w:t>
+              <w:t xml:space="preserve">  (Remote)</w:t>
             </w:r>
           </w:p>
         </w:tc>
@@ -927,7 +927,7 @@
           <w:color w:val="334155"/>
           <w:sz w:val="16"/>
         </w:rPr>
-        <w:t>Supported maintenance, diagnostic troubleshooting, and optimization of automated PLC-driven production-line systems in a high-volume FMCG manufacturing facility.</w:t>
+        <w:t>Engineered distributed backend tracking services integrating third-party carrier APIs into a normalized, idempotent event model.</w:t>
       </w:r>
     </w:p>
     <w:p>
@@ -941,7 +941,7 @@
           <w:color w:val="334155"/>
           <w:sz w:val="16"/>
         </w:rPr>
-        <w:t>Applied structured root-cause analysis (RCA) to resolve electrical and sensor faults, cutting recurring downtime; documented 5+ automation workflows and SOPs.</w:t>
+        <w:t>Built resilient background workers with exponential retry handling, duplicate-event safeguards, structured logging, and distributed tracing.</w:t>
       </w:r>
     </w:p>
     <w:tbl>
@@ -976,7 +976,7 @@
                 <w:color w:val="0F172A"/>
                 <w:sz w:val="17"/>
               </w:rPr>
-              <w:t>Student Research Assistant</w:t>
+              <w:t>Software Engineer, Platform</w:t>
             </w:r>
             <w:r>
               <w:rPr>
@@ -984,7 +984,7 @@
                 <w:color w:val="475569"/>
                 <w:sz w:val="16"/>
               </w:rPr>
-              <w:t xml:space="preserve"> | Communication Research Group &amp; Control Systems Lab</w:t>
+              <w:t xml:space="preserve"> | Fieldstone SaaS (Contract)</w:t>
             </w:r>
           </w:p>
         </w:tc>
@@ -1009,13 +1009,13 @@
                 <w:color w:val="0F172A"/>
                 <w:sz w:val="16"/>
               </w:rPr>
-              <w:t>2023 – 2025</w:t>
+              <w:t>Jun 2025 – Dec 2025</w:t>
             </w:r>
             <w:r>
               <w:rPr>
                 <w:sz w:val="15"/>
               </w:rPr>
-              <w:t xml:space="preserve">  (OAU, NG)</w:t>
+              <w:t xml:space="preserve">  (Remote)</w:t>
             </w:r>
           </w:p>
         </w:tc>
@@ -1032,7 +1032,7 @@
           <w:color w:val="334155"/>
           <w:sz w:val="16"/>
         </w:rPr>
-        <w:t>Co-developed an IoT-compatible telemetry station and simulated sensor-to-microcontroller data transmission using MATLAB and Simulink.</w:t>
+        <w:t>Refactored monolithic application services into decoupled modules, introducing asynchronous background workers to offload request-path latency.</w:t>
       </w:r>
     </w:p>
     <w:p>
@@ -1046,7 +1046,112 @@
           <w:color w:val="334155"/>
           <w:sz w:val="16"/>
         </w:rPr>
-        <w:t>Modeled Signal-to-Noise Ratio (SNR) across wireless configurations and contributed to smart metering prototypes for service-based tariff billing.</w:t>
+        <w:t>Built automated CI/CD pipelines with migration and deployment gates, health checks, and telemetry alerts resolving recurring timeouts.</w:t>
+      </w:r>
+    </w:p>
+    <w:tbl>
+      <w:tblPr>
+        <w:tblW w:type="auto" w:w="0"/>
+        <w:jc w:val="center"/>
+        <w:tblLayout w:type="fixed"/>
+        <w:tblLook w:firstColumn="1" w:firstRow="1" w:lastColumn="0" w:lastRow="0" w:noHBand="0" w:noVBand="1" w:val="04A0"/>
+      </w:tblPr>
+      <w:tblGrid>
+        <w:gridCol w:w="8352"/>
+        <w:gridCol w:w="2448"/>
+      </w:tblGrid>
+      <w:tr>
+        <w:tc>
+          <w:tcPr>
+            <w:tcW w:type="dxa" w:w="5400"/>
+            <w:tcMar>
+              <w:top w:w="0" w:type="dxa"/>
+              <w:bottom w:w="0" w:type="dxa"/>
+              <w:left w:w="0" w:type="dxa"/>
+              <w:right w:w="0" w:type="dxa"/>
+            </w:tcMar>
+          </w:tcPr>
+          <w:p>
+            <w:pPr>
+              <w:spacing w:before="70" w:after="10"/>
+            </w:pPr>
+            <w:r>
+              <w:rPr>
+                <w:b/>
+                <w:color w:val="0F172A"/>
+                <w:sz w:val="17"/>
+              </w:rPr>
+              <w:t>Applied AI &amp; Software Engineer</w:t>
+            </w:r>
+            <w:r>
+              <w:rPr>
+                <w:i/>
+                <w:color w:val="475569"/>
+                <w:sz w:val="16"/>
+              </w:rPr>
+              <w:t xml:space="preserve"> | Meridian Knowledge (Contract)</w:t>
+            </w:r>
+          </w:p>
+        </w:tc>
+        <w:tc>
+          <w:tcPr>
+            <w:tcW w:type="dxa" w:w="5400"/>
+            <w:tcMar>
+              <w:top w:w="0" w:type="dxa"/>
+              <w:bottom w:w="0" w:type="dxa"/>
+              <w:left w:w="0" w:type="dxa"/>
+              <w:right w:w="0" w:type="dxa"/>
+            </w:tcMar>
+          </w:tcPr>
+          <w:p>
+            <w:pPr>
+              <w:spacing w:before="70" w:after="10"/>
+              <w:jc w:val="right"/>
+            </w:pPr>
+            <w:r>
+              <w:rPr>
+                <w:b/>
+                <w:color w:val="0F172A"/>
+                <w:sz w:val="16"/>
+              </w:rPr>
+              <w:t>May 2024 – Oct 2025</w:t>
+            </w:r>
+            <w:r>
+              <w:rPr>
+                <w:sz w:val="15"/>
+              </w:rPr>
+              <w:t xml:space="preserve">  (Remote)</w:t>
+            </w:r>
+          </w:p>
+        </w:tc>
+      </w:tr>
+    </w:tbl>
+    <w:p>
+      <w:pPr>
+        <w:pStyle w:val="ListBullet"/>
+        <w:spacing w:before="0" w:after="24" w:line="259" w:lineRule="auto"/>
+        <w:ind w:left="259"/>
+      </w:pPr>
+      <w:r>
+        <w:rPr>
+          <w:color w:val="334155"/>
+          <w:sz w:val="16"/>
+        </w:rPr>
+        <w:t>Architected multimodal document ingestion pipelines extracting and indexing data from PDFs, scanned forms, and structured records.</w:t>
+      </w:r>
+    </w:p>
+    <w:p>
+      <w:pPr>
+        <w:pStyle w:val="ListBullet"/>
+        <w:spacing w:before="0" w:after="24" w:line="259" w:lineRule="auto"/>
+        <w:ind w:left="259"/>
+      </w:pPr>
+      <w:r>
+        <w:rPr>
+          <w:color w:val="334155"/>
+          <w:sz w:val="16"/>
+        </w:rPr>
+        <w:t>Integrated LLM extraction with deterministic validation rules, human-in-the-loop review interfaces, and automated quality evaluation suites.</w:t>
       </w:r>
     </w:p>
     <w:p>

</xml_diff>

<commit_message>
Remove Cedar Freight Technologies freelance role and regenerate resume
</commit_message>
<xml_diff>
--- a/assets/Henry_Fadeni_Applied_AI_Software_Engineer.docx
+++ b/assets/Henry_Fadeni_Applied_AI_Software_Engineer.docx
@@ -871,111 +871,6 @@
                 <w:color w:val="0F172A"/>
                 <w:sz w:val="17"/>
               </w:rPr>
-              <w:t>Backend Engineer</w:t>
-            </w:r>
-            <w:r>
-              <w:rPr>
-                <w:i/>
-                <w:color w:val="475569"/>
-                <w:sz w:val="16"/>
-              </w:rPr>
-              <w:t xml:space="preserve"> | Cedar Freight Technologies (Freelance)</w:t>
-            </w:r>
-          </w:p>
-        </w:tc>
-        <w:tc>
-          <w:tcPr>
-            <w:tcW w:type="dxa" w:w="5400"/>
-            <w:tcMar>
-              <w:top w:w="0" w:type="dxa"/>
-              <w:bottom w:w="0" w:type="dxa"/>
-              <w:left w:w="0" w:type="dxa"/>
-              <w:right w:w="0" w:type="dxa"/>
-            </w:tcMar>
-          </w:tcPr>
-          <w:p>
-            <w:pPr>
-              <w:spacing w:before="70" w:after="10"/>
-              <w:jc w:val="right"/>
-            </w:pPr>
-            <w:r>
-              <w:rPr>
-                <w:b/>
-                <w:color w:val="0F172A"/>
-                <w:sz w:val="16"/>
-              </w:rPr>
-              <w:t>Jan 2025 – Present</w:t>
-            </w:r>
-            <w:r>
-              <w:rPr>
-                <w:sz w:val="15"/>
-              </w:rPr>
-              <w:t xml:space="preserve">  (Remote)</w:t>
-            </w:r>
-          </w:p>
-        </w:tc>
-      </w:tr>
-    </w:tbl>
-    <w:p>
-      <w:pPr>
-        <w:pStyle w:val="ListBullet"/>
-        <w:spacing w:before="0" w:after="24" w:line="259" w:lineRule="auto"/>
-        <w:ind w:left="259"/>
-      </w:pPr>
-      <w:r>
-        <w:rPr>
-          <w:color w:val="334155"/>
-          <w:sz w:val="16"/>
-        </w:rPr>
-        <w:t>Engineered distributed backend tracking services integrating third-party carrier APIs into a normalized, idempotent event model.</w:t>
-      </w:r>
-    </w:p>
-    <w:p>
-      <w:pPr>
-        <w:pStyle w:val="ListBullet"/>
-        <w:spacing w:before="0" w:after="24" w:line="259" w:lineRule="auto"/>
-        <w:ind w:left="259"/>
-      </w:pPr>
-      <w:r>
-        <w:rPr>
-          <w:color w:val="334155"/>
-          <w:sz w:val="16"/>
-        </w:rPr>
-        <w:t>Built resilient background workers with exponential retry handling, duplicate-event safeguards, structured logging, and distributed tracing.</w:t>
-      </w:r>
-    </w:p>
-    <w:tbl>
-      <w:tblPr>
-        <w:tblW w:type="auto" w:w="0"/>
-        <w:jc w:val="center"/>
-        <w:tblLayout w:type="fixed"/>
-        <w:tblLook w:firstColumn="1" w:firstRow="1" w:lastColumn="0" w:lastRow="0" w:noHBand="0" w:noVBand="1" w:val="04A0"/>
-      </w:tblPr>
-      <w:tblGrid>
-        <w:gridCol w:w="8352"/>
-        <w:gridCol w:w="2448"/>
-      </w:tblGrid>
-      <w:tr>
-        <w:tc>
-          <w:tcPr>
-            <w:tcW w:type="dxa" w:w="5400"/>
-            <w:tcMar>
-              <w:top w:w="0" w:type="dxa"/>
-              <w:bottom w:w="0" w:type="dxa"/>
-              <w:left w:w="0" w:type="dxa"/>
-              <w:right w:w="0" w:type="dxa"/>
-            </w:tcMar>
-          </w:tcPr>
-          <w:p>
-            <w:pPr>
-              <w:spacing w:before="70" w:after="10"/>
-            </w:pPr>
-            <w:r>
-              <w:rPr>
-                <w:b/>
-                <w:color w:val="0F172A"/>
-                <w:sz w:val="17"/>
-              </w:rPr>
               <w:t>Software Engineer, Platform</w:t>
             </w:r>
             <w:r>

</xml_diff>

<commit_message>
Remove Fieldstone SaaS job experience and regenerate resume
</commit_message>
<xml_diff>
--- a/assets/Henry_Fadeni_Applied_AI_Software_Engineer.docx
+++ b/assets/Henry_Fadeni_Applied_AI_Software_Engineer.docx
@@ -871,111 +871,6 @@
                 <w:color w:val="0F172A"/>
                 <w:sz w:val="17"/>
               </w:rPr>
-              <w:t>Software Engineer, Platform</w:t>
-            </w:r>
-            <w:r>
-              <w:rPr>
-                <w:i/>
-                <w:color w:val="475569"/>
-                <w:sz w:val="16"/>
-              </w:rPr>
-              <w:t xml:space="preserve"> | Fieldstone SaaS (Contract)</w:t>
-            </w:r>
-          </w:p>
-        </w:tc>
-        <w:tc>
-          <w:tcPr>
-            <w:tcW w:type="dxa" w:w="5400"/>
-            <w:tcMar>
-              <w:top w:w="0" w:type="dxa"/>
-              <w:bottom w:w="0" w:type="dxa"/>
-              <w:left w:w="0" w:type="dxa"/>
-              <w:right w:w="0" w:type="dxa"/>
-            </w:tcMar>
-          </w:tcPr>
-          <w:p>
-            <w:pPr>
-              <w:spacing w:before="70" w:after="10"/>
-              <w:jc w:val="right"/>
-            </w:pPr>
-            <w:r>
-              <w:rPr>
-                <w:b/>
-                <w:color w:val="0F172A"/>
-                <w:sz w:val="16"/>
-              </w:rPr>
-              <w:t>Jun 2025 – Dec 2025</w:t>
-            </w:r>
-            <w:r>
-              <w:rPr>
-                <w:sz w:val="15"/>
-              </w:rPr>
-              <w:t xml:space="preserve">  (Remote)</w:t>
-            </w:r>
-          </w:p>
-        </w:tc>
-      </w:tr>
-    </w:tbl>
-    <w:p>
-      <w:pPr>
-        <w:pStyle w:val="ListBullet"/>
-        <w:spacing w:before="0" w:after="24" w:line="259" w:lineRule="auto"/>
-        <w:ind w:left="259"/>
-      </w:pPr>
-      <w:r>
-        <w:rPr>
-          <w:color w:val="334155"/>
-          <w:sz w:val="16"/>
-        </w:rPr>
-        <w:t>Refactored monolithic application services into decoupled modules, introducing asynchronous background workers to offload request-path latency.</w:t>
-      </w:r>
-    </w:p>
-    <w:p>
-      <w:pPr>
-        <w:pStyle w:val="ListBullet"/>
-        <w:spacing w:before="0" w:after="24" w:line="259" w:lineRule="auto"/>
-        <w:ind w:left="259"/>
-      </w:pPr>
-      <w:r>
-        <w:rPr>
-          <w:color w:val="334155"/>
-          <w:sz w:val="16"/>
-        </w:rPr>
-        <w:t>Built automated CI/CD pipelines with migration and deployment gates, health checks, and telemetry alerts resolving recurring timeouts.</w:t>
-      </w:r>
-    </w:p>
-    <w:tbl>
-      <w:tblPr>
-        <w:tblW w:type="auto" w:w="0"/>
-        <w:jc w:val="center"/>
-        <w:tblLayout w:type="fixed"/>
-        <w:tblLook w:firstColumn="1" w:firstRow="1" w:lastColumn="0" w:lastRow="0" w:noHBand="0" w:noVBand="1" w:val="04A0"/>
-      </w:tblPr>
-      <w:tblGrid>
-        <w:gridCol w:w="8352"/>
-        <w:gridCol w:w="2448"/>
-      </w:tblGrid>
-      <w:tr>
-        <w:tc>
-          <w:tcPr>
-            <w:tcW w:type="dxa" w:w="5400"/>
-            <w:tcMar>
-              <w:top w:w="0" w:type="dxa"/>
-              <w:bottom w:w="0" w:type="dxa"/>
-              <w:left w:w="0" w:type="dxa"/>
-              <w:right w:w="0" w:type="dxa"/>
-            </w:tcMar>
-          </w:tcPr>
-          <w:p>
-            <w:pPr>
-              <w:spacing w:before="70" w:after="10"/>
-            </w:pPr>
-            <w:r>
-              <w:rPr>
-                <w:b/>
-                <w:color w:val="0F172A"/>
-                <w:sz w:val="17"/>
-              </w:rPr>
               <w:t>Applied AI &amp; Software Engineer</w:t>
             </w:r>
             <w:r>

</xml_diff>